<commit_message>
AGMA 2101-E25: power or pinion torque for required safety factors
New rating goal: solve the safety factor method (7.2) for the load at the
given speed and life. No factor depends on the load there, so the load is
closed form: P_H,i = P_azu,i / (K_O (S_Hmin Y_Z)^2), P_F,i = P_ayu,i /
(K_O S_Fmin Y_Z), P_SF the smallest, T_SF = 30000 P_SF / (pi n1). The
rating is then made at that load, given as a power or a pinion torque.

- RatingGoal input; the default stays a check of the load entered
- Report section with P_H1/P_H2/P_F1/P_F2/P_SF/T_SF and the governing mode
- Minimum safety factor warnings use a 1e-9 relative slack
- Self-test: Annex B reference points and the governing S on every
  example (78 passed); example 3 rates a pinion torque
- Findings document: section 5.13 and validation 7.4

Co-Authored-By: Claude Opus 5.5 <noreply@anthropic.com>
</commit_message>
<xml_diff>
--- a/AGMA2101E25Calc/AGMA2101-E25_Implementation_Findings.docx
+++ b/AGMA2101E25Calc/AGMA2101-E25_Implementation_Findings.docx
@@ -110,7 +110,7 @@
         <w:spacing w:after="140"/>
       </w:pPr>
       <w:r>
-        <w:t xml:space="preserve">Scope, as agreed before implementation: the service factor method (clause 7.1) and the safety factor method (clause 7.2) for external spur and helical gear pairs, with every influence factor they use. Validation: all 43 values the Annex B illustrative example publishes for these two methods are reproduced (43/43 pass), and the AGMA 908 analytical I and J factors reproduce 24 of 24 transcribed points of the 908 geometry factor tables (section 7).</w:t>
+        <w:t xml:space="preserve">Scope, as agreed before implementation: the service factor method (clause 7.1) and the safety factor method (clause 7.2) for external spur and helical gear pairs, with every influence factor they use. Validation: all 44 values the Annex B illustrative example publishes for these two methods are reproduced (44/44 pass), and the AGMA 908 analytical I and J factors reproduce 24 of 24 transcribed points of the 908 geometry factor tables (section 7).</w:t>
       </w:r>
     </w:p>
     <w:p>
@@ -2079,6 +2079,23 @@
     </w:p>
     <w:p>
       <w:pPr>
+        <w:pStyle w:val="Heading2"/>
+        <w:spacing w:after="120" w:before="260"/>
+      </w:pPr>
+      <w:r>
+        <w:t xml:space="preserve">5.13 Load for the required safety factors (added 2026-10-16)</w:t>
+      </w:r>
+    </w:p>
+    <w:p>
+      <w:pPr>
+        <w:spacing w:after="140"/>
+      </w:pPr>
+      <w:r>
+        <w:t xml:space="preserve">At user request the calculator also gives the load a gear set can transmit for required safety factors: the input 'Rating goal' is CheckTransmittedLoad (the safety and service factors of the load given, as before) or RatedLoadForRequiredSafetyFactors, and 'Load as' chooses whether that load is given as a power or as a pinion torque (the other is reported too). At a given pinion speed and life no factor of the rating depends on the load (K_V on the pitch line velocity, K_H method B on the geometry and mounting, Z_N and Y_N on the number of cycles, the geometry factors on the geometry), while sigma_H grows with the square root of the load and sigma_F with the load. Setting S_H = S_Hmin and S_F = S_Fmin therefore gives, for each member, P_H = P_azu / (K_O (S_Hmin Y_Z)^2) and P_F = P_ayu / (K_O S_Fmin Y_Z) in closed form from the allowable powers of 7.1, and the load for the required safety factors is the smallest of the four, T = 30000 P / (pi n1). The report shows the four powers, the governing member and mode, and the load; in the rated goal the whole rating is then made at that load (its powers are taken from a first pass at 1 kW, which they do not depend on), so the governing safety factor equals the one required. The section is in the report in both goals. The load holds only for the speed, life and K_O given, and the yield check under peak loads (clause 19) is still not made.</w:t>
+      </w:r>
+    </w:p>
+    <w:p>
+      <w:pPr>
         <w:pStyle w:val="Heading1"/>
         <w:spacing w:after="160" w:before="360"/>
       </w:pPr>
@@ -2187,7 +2204,7 @@
         <w:spacing w:after="140"/>
       </w:pPr>
       <w:r>
-        <w:t xml:space="preserve">Annex B (B.1) is reproduced from its own input data with Z_I = 0.231, Y_J = 0.505 / 0.521 and Z_E = 190 as given. All 43 published values of the service and safety factor methods pass (43/43). The tolerance is 1e-6 relative with an absolute floor of half a unit in the sixth printed decimal, widened only where the standard's own arithmetic carries rounded intermediates (noted).</w:t>
+        <w:t xml:space="preserve">Annex B (B.1) is reproduced from its own input data with Z_I = 0.231, Y_J = 0.505 / 0.521 and Z_E = 190 as given. All 44 published values of the service and safety factor methods pass (44/44). The tolerance is 1e-6 relative with an absolute floor of half a unit in the sixth printed decimal, widened only where the standard's own arithmetic carries rounded intermediates (noted).</w:t>
       </w:r>
     </w:p>
     <w:tbl>
@@ -9296,6 +9313,167 @@
                 <w:szCs w:val="18"/>
               </w:rPr>
               <w:t xml:space="preserve"/>
+            </w:r>
+          </w:p>
+        </w:tc>
+      </w:tr>
+      <w:tr>
+        <w:trPr>
+          <w:cantSplit/>
+        </w:trPr>
+        <w:tc>
+          <w:tcPr>
+            <w:tcW w:type="dxa" w:w="1150"/>
+            <w:tcMar>
+              <w:top w:type="dxa" w:w="60"/>
+              <w:left w:type="dxa" w:w="100"/>
+              <w:bottom w:type="dxa" w:w="60"/>
+              <w:right w:type="dxa" w:w="100"/>
+            </w:tcMar>
+          </w:tcPr>
+          <w:p>
+            <w:pPr>
+              <w:spacing w:after="0"/>
+              <w:jc w:val="left"/>
+            </w:pPr>
+            <w:r>
+              <w:rPr>
+                <w:b w:val="false"/>
+                <w:bCs w:val="false"/>
+                <w:sz w:val="18"/>
+                <w:szCs w:val="18"/>
+              </w:rPr>
+              <w:t xml:space="preserve">P_SF</w:t>
+            </w:r>
+          </w:p>
+        </w:tc>
+        <w:tc>
+          <w:tcPr>
+            <w:tcW w:type="dxa" w:w="1600"/>
+            <w:tcMar>
+              <w:top w:type="dxa" w:w="60"/>
+              <w:left w:type="dxa" w:w="100"/>
+              <w:bottom w:type="dxa" w:w="60"/>
+              <w:right w:type="dxa" w:w="100"/>
+            </w:tcMar>
+          </w:tcPr>
+          <w:p>
+            <w:pPr>
+              <w:spacing w:after="0"/>
+              <w:jc w:val="left"/>
+            </w:pPr>
+            <w:r>
+              <w:rPr>
+                <w:b w:val="false"/>
+                <w:bCs w:val="false"/>
+                <w:sz w:val="18"/>
+                <w:szCs w:val="18"/>
+              </w:rPr>
+              <w:t xml:space="preserve">281.736437</w:t>
+            </w:r>
+          </w:p>
+        </w:tc>
+        <w:tc>
+          <w:tcPr>
+            <w:tcW w:type="dxa" w:w="1600"/>
+            <w:tcMar>
+              <w:top w:type="dxa" w:w="60"/>
+              <w:left w:type="dxa" w:w="100"/>
+              <w:bottom w:type="dxa" w:w="60"/>
+              <w:right w:type="dxa" w:w="100"/>
+            </w:tcMar>
+          </w:tcPr>
+          <w:p>
+            <w:pPr>
+              <w:spacing w:after="0"/>
+              <w:jc w:val="left"/>
+            </w:pPr>
+            <w:r>
+              <w:rPr>
+                <w:b w:val="false"/>
+                <w:bCs w:val="false"/>
+                <w:sz w:val="18"/>
+                <w:szCs w:val="18"/>
+              </w:rPr>
+              <w:t xml:space="preserve">281.736399</w:t>
+            </w:r>
+          </w:p>
+        </w:tc>
+        <w:tc>
+          <w:tcPr>
+            <w:tcW w:type="dxa" w:w="1000"/>
+            <w:tcMar>
+              <w:top w:type="dxa" w:w="60"/>
+              <w:left w:type="dxa" w:w="100"/>
+              <w:bottom w:type="dxa" w:w="60"/>
+              <w:right w:type="dxa" w:w="100"/>
+            </w:tcMar>
+          </w:tcPr>
+          <w:p>
+            <w:pPr>
+              <w:spacing w:after="0"/>
+              <w:jc w:val="left"/>
+            </w:pPr>
+            <w:r>
+              <w:rPr>
+                <w:b w:val="false"/>
+                <w:bCs w:val="false"/>
+                <w:sz w:val="18"/>
+                <w:szCs w:val="18"/>
+              </w:rPr>
+              <w:t xml:space="preserve">-0.0000</w:t>
+            </w:r>
+          </w:p>
+        </w:tc>
+        <w:tc>
+          <w:tcPr>
+            <w:tcW w:type="dxa" w:w="700"/>
+            <w:tcMar>
+              <w:top w:type="dxa" w:w="60"/>
+              <w:left w:type="dxa" w:w="100"/>
+              <w:bottom w:type="dxa" w:w="60"/>
+              <w:right w:type="dxa" w:w="100"/>
+            </w:tcMar>
+          </w:tcPr>
+          <w:p>
+            <w:pPr>
+              <w:spacing w:after="0"/>
+              <w:jc w:val="left"/>
+            </w:pPr>
+            <w:r>
+              <w:rPr>
+                <w:b w:val="false"/>
+                <w:bCs w:val="false"/>
+                <w:sz w:val="18"/>
+                <w:szCs w:val="18"/>
+              </w:rPr>
+              <w:t xml:space="preserve">PASS</w:t>
+            </w:r>
+          </w:p>
+        </w:tc>
+        <w:tc>
+          <w:tcPr>
+            <w:tcW w:type="dxa" w:w="3310"/>
+            <w:tcMar>
+              <w:top w:type="dxa" w:w="60"/>
+              <w:left w:type="dxa" w:w="100"/>
+              <w:bottom w:type="dxa" w:w="60"/>
+              <w:right w:type="dxa" w:w="100"/>
+            </w:tcMar>
+          </w:tcPr>
+          <w:p>
+            <w:pPr>
+              <w:spacing w:after="0"/>
+              <w:jc w:val="left"/>
+            </w:pPr>
+            <w:r>
+              <w:rPr>
+                <w:b w:val="false"/>
+                <w:bCs w:val="false"/>
+                <w:sz w:val="18"/>
+                <w:szCs w:val="18"/>
+              </w:rPr>
+              <w:t xml:space="preserve">SHmin = SFmin = 1, KO = YZ = 1: min(P_azu, P_ayu) of B.1</w:t>
             </w:r>
           </w:p>
         </w:tc>
@@ -14063,7 +14241,729 @@
         <w:spacing w:after="120" w:before="260"/>
       </w:pPr>
       <w:r>
-        <w:t xml:space="preserve">7.4 Paths without published reference values</w:t>
+        <w:t xml:space="preserve">7.4 Load for the required safety factors</w:t>
+      </w:r>
+    </w:p>
+    <w:p>
+      <w:pPr>
+        <w:spacing w:after="140"/>
+      </w:pPr>
+      <w:r>
+        <w:t xml:space="preserve">Annex B gives four reference points for the inverse rating: with S_Hmin = S_Fmin = 1 (K_O = Y_Z = 1) the power is min(P_azu, P_ayu) = 281.736437 kW; with S_Hmin = S_H1 of B.1 (1.114417) the pinion's macropitting gives back B.1's own power, 226.854406 kW, and as a pinion torque its own input torque, 1494 Nm; with S_Fmin = S_F1 of B.1 (1.38095) its bending gives the same power. The residual differences come from the six printed digits of S_H1 and S_F1. On every built-in example rated for S_H = 1.3, S_F = 1.6, the rating at the load found has its governing safety factor equal to the one required to 1e-9.</w:t>
+      </w:r>
+    </w:p>
+    <w:tbl>
+      <w:tblPr>
+        <w:tblW w:type="dxa" w:w="9000"/>
+        <w:tblBorders>
+          <w:top w:val="single" w:color="auto" w:sz="4"/>
+          <w:left w:val="single" w:color="auto" w:sz="4"/>
+          <w:bottom w:val="single" w:color="auto" w:sz="4"/>
+          <w:right w:val="single" w:color="auto" w:sz="4"/>
+          <w:insideH w:val="single" w:color="auto" w:sz="4"/>
+          <w:insideV w:val="single" w:color="auto" w:sz="4"/>
+        </w:tblBorders>
+      </w:tblPr>
+      <w:tblGrid>
+        <w:gridCol w:w="3500"/>
+        <w:gridCol w:w="1500"/>
+        <w:gridCol w:w="1500"/>
+        <w:gridCol w:w="1500"/>
+        <w:gridCol w:w="1000"/>
+      </w:tblGrid>
+      <w:tr>
+        <w:trPr>
+          <w:tblHeader/>
+        </w:trPr>
+        <w:tc>
+          <w:tcPr>
+            <w:tcW w:type="dxa" w:w="3500"/>
+            <w:shd w:fill="DCE6F2" w:val="clear"/>
+            <w:tcMar>
+              <w:top w:type="dxa" w:w="60"/>
+              <w:left w:type="dxa" w:w="100"/>
+              <w:bottom w:type="dxa" w:w="60"/>
+              <w:right w:type="dxa" w:w="100"/>
+            </w:tcMar>
+          </w:tcPr>
+          <w:p>
+            <w:pPr>
+              <w:spacing w:after="0"/>
+              <w:jc w:val="left"/>
+            </w:pPr>
+            <w:r>
+              <w:rPr>
+                <w:b/>
+                <w:bCs/>
+                <w:sz w:val="18"/>
+                <w:szCs w:val="18"/>
+              </w:rPr>
+              <w:t xml:space="preserve">Case</w:t>
+            </w:r>
+          </w:p>
+        </w:tc>
+        <w:tc>
+          <w:tcPr>
+            <w:tcW w:type="dxa" w:w="1500"/>
+            <w:shd w:fill="DCE6F2" w:val="clear"/>
+            <w:tcMar>
+              <w:top w:type="dxa" w:w="60"/>
+              <w:left w:type="dxa" w:w="100"/>
+              <w:bottom w:type="dxa" w:w="60"/>
+              <w:right w:type="dxa" w:w="100"/>
+            </w:tcMar>
+          </w:tcPr>
+          <w:p>
+            <w:pPr>
+              <w:spacing w:after="0"/>
+              <w:jc w:val="left"/>
+            </w:pPr>
+            <w:r>
+              <w:rPr>
+                <w:b/>
+                <w:bCs/>
+                <w:sz w:val="18"/>
+                <w:szCs w:val="18"/>
+              </w:rPr>
+              <w:t xml:space="preserve">Reference</w:t>
+            </w:r>
+          </w:p>
+        </w:tc>
+        <w:tc>
+          <w:tcPr>
+            <w:tcW w:type="dxa" w:w="1500"/>
+            <w:shd w:fill="DCE6F2" w:val="clear"/>
+            <w:tcMar>
+              <w:top w:type="dxa" w:w="60"/>
+              <w:left w:type="dxa" w:w="100"/>
+              <w:bottom w:type="dxa" w:w="60"/>
+              <w:right w:type="dxa" w:w="100"/>
+            </w:tcMar>
+          </w:tcPr>
+          <w:p>
+            <w:pPr>
+              <w:spacing w:after="0"/>
+              <w:jc w:val="left"/>
+            </w:pPr>
+            <w:r>
+              <w:rPr>
+                <w:b/>
+                <w:bCs/>
+                <w:sz w:val="18"/>
+                <w:szCs w:val="18"/>
+              </w:rPr>
+              <w:t xml:space="preserve">Calculated</w:t>
+            </w:r>
+          </w:p>
+        </w:tc>
+        <w:tc>
+          <w:tcPr>
+            <w:tcW w:type="dxa" w:w="1500"/>
+            <w:shd w:fill="DCE6F2" w:val="clear"/>
+            <w:tcMar>
+              <w:top w:type="dxa" w:w="60"/>
+              <w:left w:type="dxa" w:w="100"/>
+              <w:bottom w:type="dxa" w:w="60"/>
+              <w:right w:type="dxa" w:w="100"/>
+            </w:tcMar>
+          </w:tcPr>
+          <w:p>
+            <w:pPr>
+              <w:spacing w:after="0"/>
+              <w:jc w:val="left"/>
+            </w:pPr>
+            <w:r>
+              <w:rPr>
+                <w:b/>
+                <w:bCs/>
+                <w:sz w:val="18"/>
+                <w:szCs w:val="18"/>
+              </w:rPr>
+              <w:t xml:space="preserve">Diff %</w:t>
+            </w:r>
+          </w:p>
+        </w:tc>
+        <w:tc>
+          <w:tcPr>
+            <w:tcW w:type="dxa" w:w="1000"/>
+            <w:shd w:fill="DCE6F2" w:val="clear"/>
+            <w:tcMar>
+              <w:top w:type="dxa" w:w="60"/>
+              <w:left w:type="dxa" w:w="100"/>
+              <w:bottom w:type="dxa" w:w="60"/>
+              <w:right w:type="dxa" w:w="100"/>
+            </w:tcMar>
+          </w:tcPr>
+          <w:p>
+            <w:pPr>
+              <w:spacing w:after="0"/>
+              <w:jc w:val="left"/>
+            </w:pPr>
+            <w:r>
+              <w:rPr>
+                <w:b/>
+                <w:bCs/>
+                <w:sz w:val="18"/>
+                <w:szCs w:val="18"/>
+              </w:rPr>
+              <w:t xml:space="preserve">Result</w:t>
+            </w:r>
+          </w:p>
+        </w:tc>
+      </w:tr>
+      <w:tr>
+        <w:trPr>
+          <w:cantSplit/>
+        </w:trPr>
+        <w:tc>
+          <w:tcPr>
+            <w:tcW w:type="dxa" w:w="3500"/>
+            <w:tcMar>
+              <w:top w:type="dxa" w:w="60"/>
+              <w:left w:type="dxa" w:w="100"/>
+              <w:bottom w:type="dxa" w:w="60"/>
+              <w:right w:type="dxa" w:w="100"/>
+            </w:tcMar>
+          </w:tcPr>
+          <w:p>
+            <w:pPr>
+              <w:spacing w:after="0"/>
+              <w:jc w:val="left"/>
+            </w:pPr>
+            <w:r>
+              <w:rPr>
+                <w:b w:val="false"/>
+                <w:bCs w:val="false"/>
+                <w:sz w:val="18"/>
+                <w:szCs w:val="18"/>
+              </w:rPr>
+              <w:t xml:space="preserve">Annex B, S_Hmin = S_Fmin = 1: power [kW]</w:t>
+            </w:r>
+          </w:p>
+        </w:tc>
+        <w:tc>
+          <w:tcPr>
+            <w:tcW w:type="dxa" w:w="1500"/>
+            <w:tcMar>
+              <w:top w:type="dxa" w:w="60"/>
+              <w:left w:type="dxa" w:w="100"/>
+              <w:bottom w:type="dxa" w:w="60"/>
+              <w:right w:type="dxa" w:w="100"/>
+            </w:tcMar>
+          </w:tcPr>
+          <w:p>
+            <w:pPr>
+              <w:spacing w:after="0"/>
+              <w:jc w:val="left"/>
+            </w:pPr>
+            <w:r>
+              <w:rPr>
+                <w:b w:val="false"/>
+                <w:bCs w:val="false"/>
+                <w:sz w:val="18"/>
+                <w:szCs w:val="18"/>
+              </w:rPr>
+              <w:t xml:space="preserve">281.736437</w:t>
+            </w:r>
+          </w:p>
+        </w:tc>
+        <w:tc>
+          <w:tcPr>
+            <w:tcW w:type="dxa" w:w="1500"/>
+            <w:tcMar>
+              <w:top w:type="dxa" w:w="60"/>
+              <w:left w:type="dxa" w:w="100"/>
+              <w:bottom w:type="dxa" w:w="60"/>
+              <w:right w:type="dxa" w:w="100"/>
+            </w:tcMar>
+          </w:tcPr>
+          <w:p>
+            <w:pPr>
+              <w:spacing w:after="0"/>
+              <w:jc w:val="left"/>
+            </w:pPr>
+            <w:r>
+              <w:rPr>
+                <w:b w:val="false"/>
+                <w:bCs w:val="false"/>
+                <w:sz w:val="18"/>
+                <w:szCs w:val="18"/>
+              </w:rPr>
+              <w:t xml:space="preserve">281.736399</w:t>
+            </w:r>
+          </w:p>
+        </w:tc>
+        <w:tc>
+          <w:tcPr>
+            <w:tcW w:type="dxa" w:w="1500"/>
+            <w:tcMar>
+              <w:top w:type="dxa" w:w="60"/>
+              <w:left w:type="dxa" w:w="100"/>
+              <w:bottom w:type="dxa" w:w="60"/>
+              <w:right w:type="dxa" w:w="100"/>
+            </w:tcMar>
+          </w:tcPr>
+          <w:p>
+            <w:pPr>
+              <w:spacing w:after="0"/>
+              <w:jc w:val="left"/>
+            </w:pPr>
+            <w:r>
+              <w:rPr>
+                <w:b w:val="false"/>
+                <w:bCs w:val="false"/>
+                <w:sz w:val="18"/>
+                <w:szCs w:val="18"/>
+              </w:rPr>
+              <w:t xml:space="preserve">-0.0000</w:t>
+            </w:r>
+          </w:p>
+        </w:tc>
+        <w:tc>
+          <w:tcPr>
+            <w:tcW w:type="dxa" w:w="1000"/>
+            <w:tcMar>
+              <w:top w:type="dxa" w:w="60"/>
+              <w:left w:type="dxa" w:w="100"/>
+              <w:bottom w:type="dxa" w:w="60"/>
+              <w:right w:type="dxa" w:w="100"/>
+            </w:tcMar>
+          </w:tcPr>
+          <w:p>
+            <w:pPr>
+              <w:spacing w:after="0"/>
+              <w:jc w:val="left"/>
+            </w:pPr>
+            <w:r>
+              <w:rPr>
+                <w:b w:val="false"/>
+                <w:bCs w:val="false"/>
+                <w:sz w:val="18"/>
+                <w:szCs w:val="18"/>
+              </w:rPr>
+              <w:t xml:space="preserve">PASS</w:t>
+            </w:r>
+          </w:p>
+        </w:tc>
+      </w:tr>
+      <w:tr>
+        <w:trPr>
+          <w:cantSplit/>
+        </w:trPr>
+        <w:tc>
+          <w:tcPr>
+            <w:tcW w:type="dxa" w:w="3500"/>
+            <w:tcMar>
+              <w:top w:type="dxa" w:w="60"/>
+              <w:left w:type="dxa" w:w="100"/>
+              <w:bottom w:type="dxa" w:w="60"/>
+              <w:right w:type="dxa" w:w="100"/>
+            </w:tcMar>
+          </w:tcPr>
+          <w:p>
+            <w:pPr>
+              <w:spacing w:after="0"/>
+              <w:jc w:val="left"/>
+            </w:pPr>
+            <w:r>
+              <w:rPr>
+                <w:b w:val="false"/>
+                <w:bCs w:val="false"/>
+                <w:sz w:val="18"/>
+                <w:szCs w:val="18"/>
+              </w:rPr>
+              <w:t xml:space="preserve">Annex B, S_Hmin = 1.114417: power [kW]</w:t>
+            </w:r>
+          </w:p>
+        </w:tc>
+        <w:tc>
+          <w:tcPr>
+            <w:tcW w:type="dxa" w:w="1500"/>
+            <w:tcMar>
+              <w:top w:type="dxa" w:w="60"/>
+              <w:left w:type="dxa" w:w="100"/>
+              <w:bottom w:type="dxa" w:w="60"/>
+              <w:right w:type="dxa" w:w="100"/>
+            </w:tcMar>
+          </w:tcPr>
+          <w:p>
+            <w:pPr>
+              <w:spacing w:after="0"/>
+              <w:jc w:val="left"/>
+            </w:pPr>
+            <w:r>
+              <w:rPr>
+                <w:b w:val="false"/>
+                <w:bCs w:val="false"/>
+                <w:sz w:val="18"/>
+                <w:szCs w:val="18"/>
+              </w:rPr>
+              <w:t xml:space="preserve">226.854406</w:t>
+            </w:r>
+          </w:p>
+        </w:tc>
+        <w:tc>
+          <w:tcPr>
+            <w:tcW w:type="dxa" w:w="1500"/>
+            <w:tcMar>
+              <w:top w:type="dxa" w:w="60"/>
+              <w:left w:type="dxa" w:w="100"/>
+              <w:bottom w:type="dxa" w:w="60"/>
+              <w:right w:type="dxa" w:w="100"/>
+            </w:tcMar>
+          </w:tcPr>
+          <w:p>
+            <w:pPr>
+              <w:spacing w:after="0"/>
+              <w:jc w:val="left"/>
+            </w:pPr>
+            <w:r>
+              <w:rPr>
+                <w:b w:val="false"/>
+                <w:bCs w:val="false"/>
+                <w:sz w:val="18"/>
+                <w:szCs w:val="18"/>
+              </w:rPr>
+              <w:t xml:space="preserve">226.854554</w:t>
+            </w:r>
+          </w:p>
+        </w:tc>
+        <w:tc>
+          <w:tcPr>
+            <w:tcW w:type="dxa" w:w="1500"/>
+            <w:tcMar>
+              <w:top w:type="dxa" w:w="60"/>
+              <w:left w:type="dxa" w:w="100"/>
+              <w:bottom w:type="dxa" w:w="60"/>
+              <w:right w:type="dxa" w:w="100"/>
+            </w:tcMar>
+          </w:tcPr>
+          <w:p>
+            <w:pPr>
+              <w:spacing w:after="0"/>
+              <w:jc w:val="left"/>
+            </w:pPr>
+            <w:r>
+              <w:rPr>
+                <w:b w:val="false"/>
+                <w:bCs w:val="false"/>
+                <w:sz w:val="18"/>
+                <w:szCs w:val="18"/>
+              </w:rPr>
+              <w:t xml:space="preserve">0.0001</w:t>
+            </w:r>
+          </w:p>
+        </w:tc>
+        <w:tc>
+          <w:tcPr>
+            <w:tcW w:type="dxa" w:w="1000"/>
+            <w:tcMar>
+              <w:top w:type="dxa" w:w="60"/>
+              <w:left w:type="dxa" w:w="100"/>
+              <w:bottom w:type="dxa" w:w="60"/>
+              <w:right w:type="dxa" w:w="100"/>
+            </w:tcMar>
+          </w:tcPr>
+          <w:p>
+            <w:pPr>
+              <w:spacing w:after="0"/>
+              <w:jc w:val="left"/>
+            </w:pPr>
+            <w:r>
+              <w:rPr>
+                <w:b w:val="false"/>
+                <w:bCs w:val="false"/>
+                <w:sz w:val="18"/>
+                <w:szCs w:val="18"/>
+              </w:rPr>
+              <w:t xml:space="preserve">PASS</w:t>
+            </w:r>
+          </w:p>
+        </w:tc>
+      </w:tr>
+      <w:tr>
+        <w:trPr>
+          <w:cantSplit/>
+        </w:trPr>
+        <w:tc>
+          <w:tcPr>
+            <w:tcW w:type="dxa" w:w="3500"/>
+            <w:tcMar>
+              <w:top w:type="dxa" w:w="60"/>
+              <w:left w:type="dxa" w:w="100"/>
+              <w:bottom w:type="dxa" w:w="60"/>
+              <w:right w:type="dxa" w:w="100"/>
+            </w:tcMar>
+          </w:tcPr>
+          <w:p>
+            <w:pPr>
+              <w:spacing w:after="0"/>
+              <w:jc w:val="left"/>
+            </w:pPr>
+            <w:r>
+              <w:rPr>
+                <w:b w:val="false"/>
+                <w:bCs w:val="false"/>
+                <w:sz w:val="18"/>
+                <w:szCs w:val="18"/>
+              </w:rPr>
+              <w:t xml:space="preserve">Annex B, S_Hmin = 1.114417: pinion torque [Nm]</w:t>
+            </w:r>
+          </w:p>
+        </w:tc>
+        <w:tc>
+          <w:tcPr>
+            <w:tcW w:type="dxa" w:w="1500"/>
+            <w:tcMar>
+              <w:top w:type="dxa" w:w="60"/>
+              <w:left w:type="dxa" w:w="100"/>
+              <w:bottom w:type="dxa" w:w="60"/>
+              <w:right w:type="dxa" w:w="100"/>
+            </w:tcMar>
+          </w:tcPr>
+          <w:p>
+            <w:pPr>
+              <w:spacing w:after="0"/>
+              <w:jc w:val="left"/>
+            </w:pPr>
+            <w:r>
+              <w:rPr>
+                <w:b w:val="false"/>
+                <w:bCs w:val="false"/>
+                <w:sz w:val="18"/>
+                <w:szCs w:val="18"/>
+              </w:rPr>
+              <w:t xml:space="preserve">1494</w:t>
+            </w:r>
+          </w:p>
+        </w:tc>
+        <w:tc>
+          <w:tcPr>
+            <w:tcW w:type="dxa" w:w="1500"/>
+            <w:tcMar>
+              <w:top w:type="dxa" w:w="60"/>
+              <w:left w:type="dxa" w:w="100"/>
+              <w:bottom w:type="dxa" w:w="60"/>
+              <w:right w:type="dxa" w:w="100"/>
+            </w:tcMar>
+          </w:tcPr>
+          <w:p>
+            <w:pPr>
+              <w:spacing w:after="0"/>
+              <w:jc w:val="left"/>
+            </w:pPr>
+            <w:r>
+              <w:rPr>
+                <w:b w:val="false"/>
+                <w:bCs w:val="false"/>
+                <w:sz w:val="18"/>
+                <w:szCs w:val="18"/>
+              </w:rPr>
+              <w:t xml:space="preserve">1494.00098</w:t>
+            </w:r>
+          </w:p>
+        </w:tc>
+        <w:tc>
+          <w:tcPr>
+            <w:tcW w:type="dxa" w:w="1500"/>
+            <w:tcMar>
+              <w:top w:type="dxa" w:w="60"/>
+              <w:left w:type="dxa" w:w="100"/>
+              <w:bottom w:type="dxa" w:w="60"/>
+              <w:right w:type="dxa" w:w="100"/>
+            </w:tcMar>
+          </w:tcPr>
+          <w:p>
+            <w:pPr>
+              <w:spacing w:after="0"/>
+              <w:jc w:val="left"/>
+            </w:pPr>
+            <w:r>
+              <w:rPr>
+                <w:b w:val="false"/>
+                <w:bCs w:val="false"/>
+                <w:sz w:val="18"/>
+                <w:szCs w:val="18"/>
+              </w:rPr>
+              <w:t xml:space="preserve">0.0001</w:t>
+            </w:r>
+          </w:p>
+        </w:tc>
+        <w:tc>
+          <w:tcPr>
+            <w:tcW w:type="dxa" w:w="1000"/>
+            <w:tcMar>
+              <w:top w:type="dxa" w:w="60"/>
+              <w:left w:type="dxa" w:w="100"/>
+              <w:bottom w:type="dxa" w:w="60"/>
+              <w:right w:type="dxa" w:w="100"/>
+            </w:tcMar>
+          </w:tcPr>
+          <w:p>
+            <w:pPr>
+              <w:spacing w:after="0"/>
+              <w:jc w:val="left"/>
+            </w:pPr>
+            <w:r>
+              <w:rPr>
+                <w:b w:val="false"/>
+                <w:bCs w:val="false"/>
+                <w:sz w:val="18"/>
+                <w:szCs w:val="18"/>
+              </w:rPr>
+              <w:t xml:space="preserve">PASS</w:t>
+            </w:r>
+          </w:p>
+        </w:tc>
+      </w:tr>
+      <w:tr>
+        <w:trPr>
+          <w:cantSplit/>
+        </w:trPr>
+        <w:tc>
+          <w:tcPr>
+            <w:tcW w:type="dxa" w:w="3500"/>
+            <w:tcMar>
+              <w:top w:type="dxa" w:w="60"/>
+              <w:left w:type="dxa" w:w="100"/>
+              <w:bottom w:type="dxa" w:w="60"/>
+              <w:right w:type="dxa" w:w="100"/>
+            </w:tcMar>
+          </w:tcPr>
+          <w:p>
+            <w:pPr>
+              <w:spacing w:after="0"/>
+              <w:jc w:val="left"/>
+            </w:pPr>
+            <w:r>
+              <w:rPr>
+                <w:b w:val="false"/>
+                <w:bCs w:val="false"/>
+                <w:sz w:val="18"/>
+                <w:szCs w:val="18"/>
+              </w:rPr>
+              <w:t xml:space="preserve">Annex B, S_Fmin = 1.38095: power [kW]</w:t>
+            </w:r>
+          </w:p>
+        </w:tc>
+        <w:tc>
+          <w:tcPr>
+            <w:tcW w:type="dxa" w:w="1500"/>
+            <w:tcMar>
+              <w:top w:type="dxa" w:w="60"/>
+              <w:left w:type="dxa" w:w="100"/>
+              <w:bottom w:type="dxa" w:w="60"/>
+              <w:right w:type="dxa" w:w="100"/>
+            </w:tcMar>
+          </w:tcPr>
+          <w:p>
+            <w:pPr>
+              <w:spacing w:after="0"/>
+              <w:jc w:val="left"/>
+            </w:pPr>
+            <w:r>
+              <w:rPr>
+                <w:b w:val="false"/>
+                <w:bCs w:val="false"/>
+                <w:sz w:val="18"/>
+                <w:szCs w:val="18"/>
+              </w:rPr>
+              <w:t xml:space="preserve">226.854406</w:t>
+            </w:r>
+          </w:p>
+        </w:tc>
+        <w:tc>
+          <w:tcPr>
+            <w:tcW w:type="dxa" w:w="1500"/>
+            <w:tcMar>
+              <w:top w:type="dxa" w:w="60"/>
+              <w:left w:type="dxa" w:w="100"/>
+              <w:bottom w:type="dxa" w:w="60"/>
+              <w:right w:type="dxa" w:w="100"/>
+            </w:tcMar>
+          </w:tcPr>
+          <w:p>
+            <w:pPr>
+              <w:spacing w:after="0"/>
+              <w:jc w:val="left"/>
+            </w:pPr>
+            <w:r>
+              <w:rPr>
+                <w:b w:val="false"/>
+                <w:bCs w:val="false"/>
+                <w:sz w:val="18"/>
+                <w:szCs w:val="18"/>
+              </w:rPr>
+              <w:t xml:space="preserve">226.854288</w:t>
+            </w:r>
+          </w:p>
+        </w:tc>
+        <w:tc>
+          <w:tcPr>
+            <w:tcW w:type="dxa" w:w="1500"/>
+            <w:tcMar>
+              <w:top w:type="dxa" w:w="60"/>
+              <w:left w:type="dxa" w:w="100"/>
+              <w:bottom w:type="dxa" w:w="60"/>
+              <w:right w:type="dxa" w:w="100"/>
+            </w:tcMar>
+          </w:tcPr>
+          <w:p>
+            <w:pPr>
+              <w:spacing w:after="0"/>
+              <w:jc w:val="left"/>
+            </w:pPr>
+            <w:r>
+              <w:rPr>
+                <w:b w:val="false"/>
+                <w:bCs w:val="false"/>
+                <w:sz w:val="18"/>
+                <w:szCs w:val="18"/>
+              </w:rPr>
+              <w:t xml:space="preserve">-0.0001</w:t>
+            </w:r>
+          </w:p>
+        </w:tc>
+        <w:tc>
+          <w:tcPr>
+            <w:tcW w:type="dxa" w:w="1000"/>
+            <w:tcMar>
+              <w:top w:type="dxa" w:w="60"/>
+              <w:left w:type="dxa" w:w="100"/>
+              <w:bottom w:type="dxa" w:w="60"/>
+              <w:right w:type="dxa" w:w="100"/>
+            </w:tcMar>
+          </w:tcPr>
+          <w:p>
+            <w:pPr>
+              <w:spacing w:after="0"/>
+              <w:jc w:val="left"/>
+            </w:pPr>
+            <w:r>
+              <w:rPr>
+                <w:b w:val="false"/>
+                <w:bCs w:val="false"/>
+                <w:sz w:val="18"/>
+                <w:szCs w:val="18"/>
+              </w:rPr>
+              <w:t xml:space="preserve">PASS</w:t>
+            </w:r>
+          </w:p>
+        </w:tc>
+      </w:tr>
+    </w:tbl>
+    <w:p>
+      <w:pPr>
+        <w:spacing w:after="120"/>
+      </w:pPr>
+    </w:p>
+    <w:p>
+      <w:pPr>
+        <w:pStyle w:val="Heading2"/>
+        <w:spacing w:after="120" w:before="260"/>
+      </w:pPr>
+      <w:r>
+        <w:t xml:space="preserve">7.5 Paths without published reference values</w:t>
       </w:r>
     </w:p>
     <w:p>

</xml_diff>